<commit_message>
docs(srs): fix external interface table layout
</commit_message>
<xml_diff>
--- a/srs/软件需求规格说明书-SRS-V2.0.docx
+++ b/srs/软件需求规格说明书-SRS-V2.0.docx
@@ -7074,6 +7074,19 @@
     </w:tbl>
     <w:p>
       <w:pPr>
+        <w:sectPr>
+          <w:headerReference w:type="default" r:id="rId9"/>
+          <w:footerReference w:type="default" r:id="rId10"/>
+          <w:pgSz w:w="11906" w:h="16838"/>
+          <w:pgMar w:top="1361" w:right="1417" w:bottom="1247" w:left="1417" w:header="720" w:footer="720" w:gutter="0"/>
+          <w:cols w:space="720"/>
+          <w:docGrid w:linePitch="360"/>
+          <w:type w:val="nextPage"/>
+        </w:sectPr>
+      </w:pPr>
+    </w:p>
+    <w:p>
+      <w:pPr>
         <w:pStyle w:val="Heading1"/>
       </w:pPr>
       <w:r>
@@ -7123,31 +7136,43 @@
     <w:tbl>
       <w:tblPr>
         <w:tblStyle w:val="TableGrid"/>
-        <w:tblW w:type="auto" w:w="0"/>
+        <w:tblW w:type="dxa" w:w="14688"/>
         <w:jc w:val="center"/>
         <w:tblLayout w:type="fixed"/>
         <w:tblLook w:firstColumn="1" w:firstRow="1" w:lastColumn="0" w:lastRow="0" w:noHBand="0" w:noVBand="1" w:val="04A0"/>
       </w:tblPr>
       <w:tblGrid>
-        <w:gridCol w:w="2268"/>
-        <w:gridCol w:w="2268"/>
-        <w:gridCol w:w="2268"/>
-        <w:gridCol w:w="2268"/>
+        <w:gridCol w:w="1512"/>
+        <w:gridCol w:w="5400"/>
+        <w:gridCol w:w="3096"/>
+        <w:gridCol w:w="4680"/>
       </w:tblGrid>
       <w:tr>
-        <w:tc>
-          <w:tcPr>
-            <w:tcW w:type="dxa" w:w="1247"/>
+        <w:trPr>
+          <w:tblHeader w:val="true"/>
+          <w:cantSplit/>
+        </w:trPr>
+        <w:tc>
+          <w:tcPr>
+            <w:tcW w:type="dxa" w:w="1512"/>
             <w:shd w:fill="D9EAF7"/>
             <w:vAlign w:val="center"/>
-          </w:tcPr>
-          <w:p>
-            <w:pPr>
-              <w:spacing w:after="40" w:before="40"/>
+            <w:tcMar>
+              <w:top w:w="90" w:type="dxa"/>
+              <w:left w:w="90" w:type="dxa"/>
+              <w:bottom w:w="90" w:type="dxa"/>
+              <w:right w:w="90" w:type="dxa"/>
+            </w:tcMar>
+          </w:tcPr>
+          <w:p>
+            <w:pPr>
+              <w:spacing w:after="0" w:before="0" w:line="252" w:lineRule="auto"/>
+              <w:jc w:val="center"/>
             </w:pPr>
             <w:r>
               <w:rPr>
                 <w:b/>
+                <w:sz w:val="19"/>
               </w:rPr>
               <w:t>方法</w:t>
             </w:r>
@@ -7155,17 +7180,25 @@
         </w:tc>
         <w:tc>
           <w:tcPr>
-            <w:tcW w:type="dxa" w:w="2948"/>
+            <w:tcW w:type="dxa" w:w="5400"/>
             <w:shd w:fill="D9EAF7"/>
             <w:vAlign w:val="center"/>
-          </w:tcPr>
-          <w:p>
-            <w:pPr>
-              <w:spacing w:after="40" w:before="40"/>
+            <w:tcMar>
+              <w:top w:w="90" w:type="dxa"/>
+              <w:left w:w="90" w:type="dxa"/>
+              <w:bottom w:w="90" w:type="dxa"/>
+              <w:right w:w="90" w:type="dxa"/>
+            </w:tcMar>
+          </w:tcPr>
+          <w:p>
+            <w:pPr>
+              <w:spacing w:after="0" w:before="0" w:line="252" w:lineRule="auto"/>
+              <w:jc w:val="left"/>
             </w:pPr>
             <w:r>
               <w:rPr>
                 <w:b/>
+                <w:sz w:val="19"/>
               </w:rPr>
               <w:t>路径</w:t>
             </w:r>
@@ -7173,17 +7206,25 @@
         </w:tc>
         <w:tc>
           <w:tcPr>
-            <w:tcW w:type="dxa" w:w="1814"/>
+            <w:tcW w:type="dxa" w:w="3096"/>
             <w:shd w:fill="D9EAF7"/>
             <w:vAlign w:val="center"/>
-          </w:tcPr>
-          <w:p>
-            <w:pPr>
-              <w:spacing w:after="40" w:before="40"/>
+            <w:tcMar>
+              <w:top w:w="90" w:type="dxa"/>
+              <w:left w:w="90" w:type="dxa"/>
+              <w:bottom w:w="90" w:type="dxa"/>
+              <w:right w:w="90" w:type="dxa"/>
+            </w:tcMar>
+          </w:tcPr>
+          <w:p>
+            <w:pPr>
+              <w:spacing w:after="0" w:before="0" w:line="252" w:lineRule="auto"/>
+              <w:jc w:val="center"/>
             </w:pPr>
             <w:r>
               <w:rPr>
                 <w:b/>
+                <w:sz w:val="19"/>
               </w:rPr>
               <w:t>角色</w:t>
             </w:r>
@@ -7191,17 +7232,25 @@
         </w:tc>
         <w:tc>
           <w:tcPr>
-            <w:tcW w:type="dxa" w:w="3061"/>
+            <w:tcW w:type="dxa" w:w="4680"/>
             <w:shd w:fill="D9EAF7"/>
             <w:vAlign w:val="center"/>
-          </w:tcPr>
-          <w:p>
-            <w:pPr>
-              <w:spacing w:after="40" w:before="40"/>
+            <w:tcMar>
+              <w:top w:w="90" w:type="dxa"/>
+              <w:left w:w="90" w:type="dxa"/>
+              <w:bottom w:w="90" w:type="dxa"/>
+              <w:right w:w="90" w:type="dxa"/>
+            </w:tcMar>
+          </w:tcPr>
+          <w:p>
+            <w:pPr>
+              <w:spacing w:after="0" w:before="0" w:line="252" w:lineRule="auto"/>
+              <w:jc w:val="left"/>
             </w:pPr>
             <w:r>
               <w:rPr>
                 <w:b/>
+                <w:sz w:val="19"/>
               </w:rPr>
               <w:t>能力</w:t>
             </w:r>
@@ -7209,760 +7258,1332 @@
         </w:tc>
       </w:tr>
       <w:tr>
-        <w:tc>
-          <w:tcPr>
-            <w:tcW w:type="dxa" w:w="1247"/>
-            <w:vAlign w:val="center"/>
-          </w:tcPr>
-          <w:p>
-            <w:pPr>
-              <w:spacing w:after="40" w:before="40"/>
-            </w:pPr>
-            <w:r>
+        <w:trPr>
+          <w:cantSplit/>
+        </w:trPr>
+        <w:tc>
+          <w:tcPr>
+            <w:tcW w:type="dxa" w:w="1512"/>
+            <w:vAlign w:val="center"/>
+            <w:tcMar>
+              <w:top w:w="90" w:type="dxa"/>
+              <w:left w:w="90" w:type="dxa"/>
+              <w:bottom w:w="90" w:type="dxa"/>
+              <w:right w:w="90" w:type="dxa"/>
+            </w:tcMar>
+          </w:tcPr>
+          <w:p>
+            <w:pPr>
+              <w:spacing w:after="0" w:before="0" w:line="252" w:lineRule="auto"/>
+              <w:jc w:val="center"/>
+            </w:pPr>
+            <w:r>
+              <w:rPr>
+                <w:sz w:val="19"/>
+              </w:rPr>
               <w:t>GET</w:t>
             </w:r>
           </w:p>
         </w:tc>
         <w:tc>
           <w:tcPr>
-            <w:tcW w:type="dxa" w:w="2948"/>
-            <w:vAlign w:val="center"/>
-          </w:tcPr>
-          <w:p>
-            <w:pPr>
-              <w:spacing w:after="40" w:before="40"/>
-            </w:pPr>
-            <w:r>
+            <w:tcW w:type="dxa" w:w="5400"/>
+            <w:vAlign w:val="center"/>
+            <w:tcMar>
+              <w:top w:w="90" w:type="dxa"/>
+              <w:left w:w="90" w:type="dxa"/>
+              <w:bottom w:w="90" w:type="dxa"/>
+              <w:right w:w="90" w:type="dxa"/>
+            </w:tcMar>
+          </w:tcPr>
+          <w:p>
+            <w:pPr>
+              <w:spacing w:after="0" w:before="0" w:line="252" w:lineRule="auto"/>
+              <w:jc w:val="left"/>
+            </w:pPr>
+            <w:r>
+              <w:rPr>
+                <w:sz w:val="19"/>
+              </w:rPr>
               <w:t>/business-categories</w:t>
             </w:r>
           </w:p>
         </w:tc>
         <w:tc>
           <w:tcPr>
-            <w:tcW w:type="dxa" w:w="1814"/>
-            <w:vAlign w:val="center"/>
-          </w:tcPr>
-          <w:p>
-            <w:pPr>
-              <w:spacing w:after="40" w:before="40"/>
-            </w:pPr>
-            <w:r>
+            <w:tcW w:type="dxa" w:w="3096"/>
+            <w:vAlign w:val="center"/>
+            <w:tcMar>
+              <w:top w:w="90" w:type="dxa"/>
+              <w:left w:w="90" w:type="dxa"/>
+              <w:bottom w:w="90" w:type="dxa"/>
+              <w:right w:w="90" w:type="dxa"/>
+            </w:tcMar>
+          </w:tcPr>
+          <w:p>
+            <w:pPr>
+              <w:spacing w:after="0" w:before="0" w:line="252" w:lineRule="auto"/>
+              <w:jc w:val="center"/>
+            </w:pPr>
+            <w:r>
+              <w:rPr>
+                <w:sz w:val="19"/>
+              </w:rPr>
               <w:t>公开</w:t>
             </w:r>
           </w:p>
         </w:tc>
         <w:tc>
           <w:tcPr>
-            <w:tcW w:type="dxa" w:w="3061"/>
-            <w:vAlign w:val="center"/>
-          </w:tcPr>
-          <w:p>
-            <w:pPr>
-              <w:spacing w:after="40" w:before="40"/>
-            </w:pPr>
-            <w:r>
+            <w:tcW w:type="dxa" w:w="4680"/>
+            <w:vAlign w:val="center"/>
+            <w:tcMar>
+              <w:top w:w="90" w:type="dxa"/>
+              <w:left w:w="90" w:type="dxa"/>
+              <w:bottom w:w="90" w:type="dxa"/>
+              <w:right w:w="90" w:type="dxa"/>
+            </w:tcMar>
+          </w:tcPr>
+          <w:p>
+            <w:pPr>
+              <w:spacing w:after="0" w:before="0" w:line="252" w:lineRule="auto"/>
+              <w:jc w:val="left"/>
+            </w:pPr>
+            <w:r>
+              <w:rPr>
+                <w:sz w:val="19"/>
+              </w:rPr>
               <w:t>读取启用类别</w:t>
             </w:r>
           </w:p>
         </w:tc>
       </w:tr>
       <w:tr>
-        <w:tc>
-          <w:tcPr>
-            <w:tcW w:type="dxa" w:w="1247"/>
-            <w:vAlign w:val="center"/>
-          </w:tcPr>
-          <w:p>
-            <w:pPr>
-              <w:spacing w:after="40" w:before="40"/>
-            </w:pPr>
-            <w:r>
+        <w:trPr>
+          <w:cantSplit/>
+        </w:trPr>
+        <w:tc>
+          <w:tcPr>
+            <w:tcW w:type="dxa" w:w="1512"/>
+            <w:vAlign w:val="center"/>
+            <w:tcMar>
+              <w:top w:w="90" w:type="dxa"/>
+              <w:left w:w="90" w:type="dxa"/>
+              <w:bottom w:w="90" w:type="dxa"/>
+              <w:right w:w="90" w:type="dxa"/>
+            </w:tcMar>
+          </w:tcPr>
+          <w:p>
+            <w:pPr>
+              <w:spacing w:after="0" w:before="0" w:line="252" w:lineRule="auto"/>
+              <w:jc w:val="center"/>
+            </w:pPr>
+            <w:r>
+              <w:rPr>
+                <w:sz w:val="19"/>
+              </w:rPr>
               <w:t>POST</w:t>
             </w:r>
           </w:p>
         </w:tc>
         <w:tc>
           <w:tcPr>
-            <w:tcW w:type="dxa" w:w="2948"/>
-            <w:vAlign w:val="center"/>
-          </w:tcPr>
-          <w:p>
-            <w:pPr>
-              <w:spacing w:after="40" w:before="40"/>
-            </w:pPr>
-            <w:r>
+            <w:tcW w:type="dxa" w:w="5400"/>
+            <w:vAlign w:val="center"/>
+            <w:tcMar>
+              <w:top w:w="90" w:type="dxa"/>
+              <w:left w:w="90" w:type="dxa"/>
+              <w:bottom w:w="90" w:type="dxa"/>
+              <w:right w:w="90" w:type="dxa"/>
+            </w:tcMar>
+          </w:tcPr>
+          <w:p>
+            <w:pPr>
+              <w:spacing w:after="0" w:before="0" w:line="252" w:lineRule="auto"/>
+              <w:jc w:val="left"/>
+            </w:pPr>
+            <w:r>
+              <w:rPr>
+                <w:sz w:val="19"/>
+              </w:rPr>
               <w:t>/merchants</w:t>
             </w:r>
           </w:p>
         </w:tc>
         <w:tc>
           <w:tcPr>
-            <w:tcW w:type="dxa" w:w="1814"/>
-            <w:vAlign w:val="center"/>
-          </w:tcPr>
-          <w:p>
-            <w:pPr>
-              <w:spacing w:after="40" w:before="40"/>
-            </w:pPr>
-            <w:r>
+            <w:tcW w:type="dxa" w:w="3096"/>
+            <w:vAlign w:val="center"/>
+            <w:tcMar>
+              <w:top w:w="90" w:type="dxa"/>
+              <w:left w:w="90" w:type="dxa"/>
+              <w:bottom w:w="90" w:type="dxa"/>
+              <w:right w:w="90" w:type="dxa"/>
+            </w:tcMar>
+          </w:tcPr>
+          <w:p>
+            <w:pPr>
+              <w:spacing w:after="0" w:before="0" w:line="252" w:lineRule="auto"/>
+              <w:jc w:val="center"/>
+            </w:pPr>
+            <w:r>
+              <w:rPr>
+                <w:sz w:val="19"/>
+              </w:rPr>
               <w:t>公开</w:t>
             </w:r>
           </w:p>
         </w:tc>
         <w:tc>
           <w:tcPr>
-            <w:tcW w:type="dxa" w:w="3061"/>
-            <w:vAlign w:val="center"/>
-          </w:tcPr>
-          <w:p>
-            <w:pPr>
-              <w:spacing w:after="40" w:before="40"/>
-            </w:pPr>
-            <w:r>
+            <w:tcW w:type="dxa" w:w="4680"/>
+            <w:vAlign w:val="center"/>
+            <w:tcMar>
+              <w:top w:w="90" w:type="dxa"/>
+              <w:left w:w="90" w:type="dxa"/>
+              <w:bottom w:w="90" w:type="dxa"/>
+              <w:right w:w="90" w:type="dxa"/>
+            </w:tcMar>
+          </w:tcPr>
+          <w:p>
+            <w:pPr>
+              <w:spacing w:after="0" w:before="0" w:line="252" w:lineRule="auto"/>
+              <w:jc w:val="left"/>
+            </w:pPr>
+            <w:r>
+              <w:rPr>
+                <w:sz w:val="19"/>
+              </w:rPr>
               <w:t>注册商家并创建店铺</w:t>
             </w:r>
           </w:p>
         </w:tc>
       </w:tr>
       <w:tr>
-        <w:tc>
-          <w:tcPr>
-            <w:tcW w:type="dxa" w:w="1247"/>
-            <w:vAlign w:val="center"/>
-          </w:tcPr>
-          <w:p>
-            <w:pPr>
-              <w:spacing w:after="40" w:before="40"/>
-            </w:pPr>
-            <w:r>
+        <w:trPr>
+          <w:cantSplit/>
+        </w:trPr>
+        <w:tc>
+          <w:tcPr>
+            <w:tcW w:type="dxa" w:w="1512"/>
+            <w:vAlign w:val="center"/>
+            <w:tcMar>
+              <w:top w:w="90" w:type="dxa"/>
+              <w:left w:w="90" w:type="dxa"/>
+              <w:bottom w:w="90" w:type="dxa"/>
+              <w:right w:w="90" w:type="dxa"/>
+            </w:tcMar>
+          </w:tcPr>
+          <w:p>
+            <w:pPr>
+              <w:spacing w:after="0" w:before="0" w:line="252" w:lineRule="auto"/>
+              <w:jc w:val="center"/>
+            </w:pPr>
+            <w:r>
+              <w:rPr>
+                <w:sz w:val="19"/>
+              </w:rPr>
               <w:t>PATCH/DELETE</w:t>
             </w:r>
           </w:p>
         </w:tc>
         <w:tc>
           <w:tcPr>
-            <w:tcW w:type="dxa" w:w="2948"/>
-            <w:vAlign w:val="center"/>
-          </w:tcPr>
-          <w:p>
-            <w:pPr>
-              <w:spacing w:after="40" w:before="40"/>
-            </w:pPr>
-            <w:r>
+            <w:tcW w:type="dxa" w:w="5400"/>
+            <w:vAlign w:val="center"/>
+            <w:tcMar>
+              <w:top w:w="90" w:type="dxa"/>
+              <w:left w:w="90" w:type="dxa"/>
+              <w:bottom w:w="90" w:type="dxa"/>
+              <w:right w:w="90" w:type="dxa"/>
+            </w:tcMar>
+          </w:tcPr>
+          <w:p>
+            <w:pPr>
+              <w:spacing w:after="0" w:before="0" w:line="252" w:lineRule="auto"/>
+              <w:jc w:val="left"/>
+            </w:pPr>
+            <w:r>
+              <w:rPr>
+                <w:sz w:val="19"/>
+              </w:rPr>
               <w:t>/merchants/me</w:t>
             </w:r>
           </w:p>
         </w:tc>
         <w:tc>
           <w:tcPr>
-            <w:tcW w:type="dxa" w:w="1814"/>
-            <w:vAlign w:val="center"/>
-          </w:tcPr>
-          <w:p>
-            <w:pPr>
-              <w:spacing w:after="40" w:before="40"/>
-            </w:pPr>
-            <w:r>
+            <w:tcW w:type="dxa" w:w="3096"/>
+            <w:vAlign w:val="center"/>
+            <w:tcMar>
+              <w:top w:w="90" w:type="dxa"/>
+              <w:left w:w="90" w:type="dxa"/>
+              <w:bottom w:w="90" w:type="dxa"/>
+              <w:right w:w="90" w:type="dxa"/>
+            </w:tcMar>
+          </w:tcPr>
+          <w:p>
+            <w:pPr>
+              <w:spacing w:after="0" w:before="0" w:line="252" w:lineRule="auto"/>
+              <w:jc w:val="center"/>
+            </w:pPr>
+            <w:r>
+              <w:rPr>
+                <w:sz w:val="19"/>
+              </w:rPr>
               <w:t>MERCHANT</w:t>
             </w:r>
           </w:p>
         </w:tc>
         <w:tc>
           <w:tcPr>
-            <w:tcW w:type="dxa" w:w="3061"/>
-            <w:vAlign w:val="center"/>
-          </w:tcPr>
-          <w:p>
-            <w:pPr>
-              <w:spacing w:after="40" w:before="40"/>
-            </w:pPr>
-            <w:r>
+            <w:tcW w:type="dxa" w:w="4680"/>
+            <w:vAlign w:val="center"/>
+            <w:tcMar>
+              <w:top w:w="90" w:type="dxa"/>
+              <w:left w:w="90" w:type="dxa"/>
+              <w:bottom w:w="90" w:type="dxa"/>
+              <w:right w:w="90" w:type="dxa"/>
+            </w:tcMar>
+          </w:tcPr>
+          <w:p>
+            <w:pPr>
+              <w:spacing w:after="0" w:before="0" w:line="252" w:lineRule="auto"/>
+              <w:jc w:val="left"/>
+            </w:pPr>
+            <w:r>
+              <w:rPr>
+                <w:sz w:val="19"/>
+              </w:rPr>
               <w:t>编辑经营类别/店铺资料；注销</w:t>
             </w:r>
           </w:p>
         </w:tc>
       </w:tr>
       <w:tr>
-        <w:tc>
-          <w:tcPr>
-            <w:tcW w:type="dxa" w:w="1247"/>
-            <w:vAlign w:val="center"/>
-          </w:tcPr>
-          <w:p>
-            <w:pPr>
-              <w:spacing w:after="40" w:before="40"/>
-            </w:pPr>
-            <w:r>
+        <w:trPr>
+          <w:cantSplit/>
+        </w:trPr>
+        <w:tc>
+          <w:tcPr>
+            <w:tcW w:type="dxa" w:w="1512"/>
+            <w:vAlign w:val="center"/>
+            <w:tcMar>
+              <w:top w:w="90" w:type="dxa"/>
+              <w:left w:w="90" w:type="dxa"/>
+              <w:bottom w:w="90" w:type="dxa"/>
+              <w:right w:w="90" w:type="dxa"/>
+            </w:tcMar>
+          </w:tcPr>
+          <w:p>
+            <w:pPr>
+              <w:spacing w:after="0" w:before="0" w:line="252" w:lineRule="auto"/>
+              <w:jc w:val="center"/>
+            </w:pPr>
+            <w:r>
+              <w:rPr>
+                <w:sz w:val="19"/>
+              </w:rPr>
               <w:t>GET/PATCH</w:t>
             </w:r>
           </w:p>
         </w:tc>
         <w:tc>
           <w:tcPr>
-            <w:tcW w:type="dxa" w:w="2948"/>
-            <w:vAlign w:val="center"/>
-          </w:tcPr>
-          <w:p>
-            <w:pPr>
-              <w:spacing w:after="40" w:before="40"/>
-            </w:pPr>
-            <w:r>
+            <w:tcW w:type="dxa" w:w="5400"/>
+            <w:vAlign w:val="center"/>
+            <w:tcMar>
+              <w:top w:w="90" w:type="dxa"/>
+              <w:left w:w="90" w:type="dxa"/>
+              <w:bottom w:w="90" w:type="dxa"/>
+              <w:right w:w="90" w:type="dxa"/>
+            </w:tcMar>
+          </w:tcPr>
+          <w:p>
+            <w:pPr>
+              <w:spacing w:after="0" w:before="0" w:line="252" w:lineRule="auto"/>
+              <w:jc w:val="left"/>
+            </w:pPr>
+            <w:r>
+              <w:rPr>
+                <w:sz w:val="19"/>
+              </w:rPr>
               <w:t>/cart/delivery-info/{shopId}</w:t>
             </w:r>
           </w:p>
         </w:tc>
         <w:tc>
           <w:tcPr>
-            <w:tcW w:type="dxa" w:w="1814"/>
-            <w:vAlign w:val="center"/>
-          </w:tcPr>
-          <w:p>
-            <w:pPr>
-              <w:spacing w:after="40" w:before="40"/>
-            </w:pPr>
-            <w:r>
+            <w:tcW w:type="dxa" w:w="3096"/>
+            <w:vAlign w:val="center"/>
+            <w:tcMar>
+              <w:top w:w="90" w:type="dxa"/>
+              <w:left w:w="90" w:type="dxa"/>
+              <w:bottom w:w="90" w:type="dxa"/>
+              <w:right w:w="90" w:type="dxa"/>
+            </w:tcMar>
+          </w:tcPr>
+          <w:p>
+            <w:pPr>
+              <w:spacing w:after="0" w:before="0" w:line="252" w:lineRule="auto"/>
+              <w:jc w:val="center"/>
+            </w:pPr>
+            <w:r>
+              <w:rPr>
+                <w:sz w:val="19"/>
+              </w:rPr>
               <w:t>CUSTOMER</w:t>
             </w:r>
           </w:p>
         </w:tc>
         <w:tc>
           <w:tcPr>
-            <w:tcW w:type="dxa" w:w="3061"/>
-            <w:vAlign w:val="center"/>
-          </w:tcPr>
-          <w:p>
-            <w:pPr>
-              <w:spacing w:after="40" w:before="40"/>
-            </w:pPr>
-            <w:r>
+            <w:tcW w:type="dxa" w:w="4680"/>
+            <w:vAlign w:val="center"/>
+            <w:tcMar>
+              <w:top w:w="90" w:type="dxa"/>
+              <w:left w:w="90" w:type="dxa"/>
+              <w:bottom w:w="90" w:type="dxa"/>
+              <w:right w:w="90" w:type="dxa"/>
+            </w:tcMar>
+          </w:tcPr>
+          <w:p>
+            <w:pPr>
+              <w:spacing w:after="0" w:before="0" w:line="252" w:lineRule="auto"/>
+              <w:jc w:val="left"/>
+            </w:pPr>
+            <w:r>
+              <w:rPr>
+                <w:sz w:val="19"/>
+              </w:rPr>
               <w:t>读取/保存店铺购物车收货信息</w:t>
             </w:r>
           </w:p>
         </w:tc>
       </w:tr>
       <w:tr>
-        <w:tc>
-          <w:tcPr>
-            <w:tcW w:type="dxa" w:w="1247"/>
-            <w:vAlign w:val="center"/>
-          </w:tcPr>
-          <w:p>
-            <w:pPr>
-              <w:spacing w:after="40" w:before="40"/>
-            </w:pPr>
-            <w:r>
+        <w:trPr>
+          <w:cantSplit/>
+        </w:trPr>
+        <w:tc>
+          <w:tcPr>
+            <w:tcW w:type="dxa" w:w="1512"/>
+            <w:vAlign w:val="center"/>
+            <w:tcMar>
+              <w:top w:w="90" w:type="dxa"/>
+              <w:left w:w="90" w:type="dxa"/>
+              <w:bottom w:w="90" w:type="dxa"/>
+              <w:right w:w="90" w:type="dxa"/>
+            </w:tcMar>
+          </w:tcPr>
+          <w:p>
+            <w:pPr>
+              <w:spacing w:after="0" w:before="0" w:line="252" w:lineRule="auto"/>
+              <w:jc w:val="center"/>
+            </w:pPr>
+            <w:r>
+              <w:rPr>
+                <w:sz w:val="19"/>
+              </w:rPr>
               <w:t>POST</w:t>
             </w:r>
           </w:p>
         </w:tc>
         <w:tc>
           <w:tcPr>
-            <w:tcW w:type="dxa" w:w="2948"/>
-            <w:vAlign w:val="center"/>
-          </w:tcPr>
-          <w:p>
-            <w:pPr>
-              <w:spacing w:after="40" w:before="40"/>
-            </w:pPr>
-            <w:r>
+            <w:tcW w:type="dxa" w:w="5400"/>
+            <w:vAlign w:val="center"/>
+            <w:tcMar>
+              <w:top w:w="90" w:type="dxa"/>
+              <w:left w:w="90" w:type="dxa"/>
+              <w:bottom w:w="90" w:type="dxa"/>
+              <w:right w:w="90" w:type="dxa"/>
+            </w:tcMar>
+          </w:tcPr>
+          <w:p>
+            <w:pPr>
+              <w:spacing w:after="0" w:before="0" w:line="252" w:lineRule="auto"/>
+              <w:jc w:val="left"/>
+            </w:pPr>
+            <w:r>
+              <w:rPr>
+                <w:sz w:val="19"/>
+              </w:rPr>
               <w:t>/orders</w:t>
             </w:r>
           </w:p>
         </w:tc>
         <w:tc>
           <w:tcPr>
-            <w:tcW w:type="dxa" w:w="1814"/>
-            <w:vAlign w:val="center"/>
-          </w:tcPr>
-          <w:p>
-            <w:pPr>
-              <w:spacing w:after="40" w:before="40"/>
-            </w:pPr>
-            <w:r>
+            <w:tcW w:type="dxa" w:w="3096"/>
+            <w:vAlign w:val="center"/>
+            <w:tcMar>
+              <w:top w:w="90" w:type="dxa"/>
+              <w:left w:w="90" w:type="dxa"/>
+              <w:bottom w:w="90" w:type="dxa"/>
+              <w:right w:w="90" w:type="dxa"/>
+            </w:tcMar>
+          </w:tcPr>
+          <w:p>
+            <w:pPr>
+              <w:spacing w:after="0" w:before="0" w:line="252" w:lineRule="auto"/>
+              <w:jc w:val="center"/>
+            </w:pPr>
+            <w:r>
+              <w:rPr>
+                <w:sz w:val="19"/>
+              </w:rPr>
               <w:t>CUSTOMER</w:t>
             </w:r>
           </w:p>
         </w:tc>
         <w:tc>
           <w:tcPr>
-            <w:tcW w:type="dxa" w:w="3061"/>
-            <w:vAlign w:val="center"/>
-          </w:tcPr>
-          <w:p>
-            <w:pPr>
-              <w:spacing w:after="40" w:before="40"/>
-            </w:pPr>
-            <w:r>
+            <w:tcW w:type="dxa" w:w="4680"/>
+            <w:vAlign w:val="center"/>
+            <w:tcMar>
+              <w:top w:w="90" w:type="dxa"/>
+              <w:left w:w="90" w:type="dxa"/>
+              <w:bottom w:w="90" w:type="dxa"/>
+              <w:right w:w="90" w:type="dxa"/>
+            </w:tcMar>
+          </w:tcPr>
+          <w:p>
+            <w:pPr>
+              <w:spacing w:after="0" w:before="0" w:line="252" w:lineRule="auto"/>
+              <w:jc w:val="left"/>
+            </w:pPr>
+            <w:r>
+              <w:rPr>
+                <w:sz w:val="19"/>
+              </w:rPr>
               <w:t>创建订单和收货快照</w:t>
             </w:r>
           </w:p>
         </w:tc>
       </w:tr>
       <w:tr>
-        <w:tc>
-          <w:tcPr>
-            <w:tcW w:type="dxa" w:w="1247"/>
-            <w:vAlign w:val="center"/>
-          </w:tcPr>
-          <w:p>
-            <w:pPr>
-              <w:spacing w:after="40" w:before="40"/>
-            </w:pPr>
-            <w:r>
+        <w:trPr>
+          <w:cantSplit/>
+        </w:trPr>
+        <w:tc>
+          <w:tcPr>
+            <w:tcW w:type="dxa" w:w="1512"/>
+            <w:vAlign w:val="center"/>
+            <w:tcMar>
+              <w:top w:w="90" w:type="dxa"/>
+              <w:left w:w="90" w:type="dxa"/>
+              <w:bottom w:w="90" w:type="dxa"/>
+              <w:right w:w="90" w:type="dxa"/>
+            </w:tcMar>
+          </w:tcPr>
+          <w:p>
+            <w:pPr>
+              <w:spacing w:after="0" w:before="0" w:line="252" w:lineRule="auto"/>
+              <w:jc w:val="center"/>
+            </w:pPr>
+            <w:r>
+              <w:rPr>
+                <w:sz w:val="19"/>
+              </w:rPr>
               <w:t>POST</w:t>
             </w:r>
           </w:p>
         </w:tc>
         <w:tc>
           <w:tcPr>
-            <w:tcW w:type="dxa" w:w="2948"/>
-            <w:vAlign w:val="center"/>
-          </w:tcPr>
-          <w:p>
-            <w:pPr>
-              <w:spacing w:after="40" w:before="40"/>
-            </w:pPr>
-            <w:r>
+            <w:tcW w:type="dxa" w:w="5400"/>
+            <w:vAlign w:val="center"/>
+            <w:tcMar>
+              <w:top w:w="90" w:type="dxa"/>
+              <w:left w:w="90" w:type="dxa"/>
+              <w:bottom w:w="90" w:type="dxa"/>
+              <w:right w:w="90" w:type="dxa"/>
+            </w:tcMar>
+          </w:tcPr>
+          <w:p>
+            <w:pPr>
+              <w:spacing w:after="0" w:before="0" w:line="252" w:lineRule="auto"/>
+              <w:jc w:val="left"/>
+            </w:pPr>
+            <w:r>
+              <w:rPr>
+                <w:sz w:val="19"/>
+              </w:rPr>
               <w:t>/orders/{id}/pay</w:t>
             </w:r>
           </w:p>
         </w:tc>
         <w:tc>
           <w:tcPr>
-            <w:tcW w:type="dxa" w:w="1814"/>
-            <w:vAlign w:val="center"/>
-          </w:tcPr>
-          <w:p>
-            <w:pPr>
-              <w:spacing w:after="40" w:before="40"/>
-            </w:pPr>
-            <w:r>
+            <w:tcW w:type="dxa" w:w="3096"/>
+            <w:vAlign w:val="center"/>
+            <w:tcMar>
+              <w:top w:w="90" w:type="dxa"/>
+              <w:left w:w="90" w:type="dxa"/>
+              <w:bottom w:w="90" w:type="dxa"/>
+              <w:right w:w="90" w:type="dxa"/>
+            </w:tcMar>
+          </w:tcPr>
+          <w:p>
+            <w:pPr>
+              <w:spacing w:after="0" w:before="0" w:line="252" w:lineRule="auto"/>
+              <w:jc w:val="center"/>
+            </w:pPr>
+            <w:r>
+              <w:rPr>
+                <w:sz w:val="19"/>
+              </w:rPr>
               <w:t>CUSTOMER</w:t>
             </w:r>
           </w:p>
         </w:tc>
         <w:tc>
           <w:tcPr>
-            <w:tcW w:type="dxa" w:w="3061"/>
-            <w:vAlign w:val="center"/>
-          </w:tcPr>
-          <w:p>
-            <w:pPr>
-              <w:spacing w:after="40" w:before="40"/>
-            </w:pPr>
-            <w:r>
+            <w:tcW w:type="dxa" w:w="4680"/>
+            <w:vAlign w:val="center"/>
+            <w:tcMar>
+              <w:top w:w="90" w:type="dxa"/>
+              <w:left w:w="90" w:type="dxa"/>
+              <w:bottom w:w="90" w:type="dxa"/>
+              <w:right w:w="90" w:type="dxa"/>
+            </w:tcMar>
+          </w:tcPr>
+          <w:p>
+            <w:pPr>
+              <w:spacing w:after="0" w:before="0" w:line="252" w:lineRule="auto"/>
+              <w:jc w:val="left"/>
+            </w:pPr>
+            <w:r>
+              <w:rPr>
+                <w:sz w:val="19"/>
+              </w:rPr>
               <w:t>截止前平台内支付</w:t>
             </w:r>
           </w:p>
         </w:tc>
       </w:tr>
       <w:tr>
-        <w:tc>
-          <w:tcPr>
-            <w:tcW w:type="dxa" w:w="1247"/>
-            <w:vAlign w:val="center"/>
-          </w:tcPr>
-          <w:p>
-            <w:pPr>
-              <w:spacing w:after="40" w:before="40"/>
-            </w:pPr>
-            <w:r>
+        <w:trPr>
+          <w:cantSplit/>
+        </w:trPr>
+        <w:tc>
+          <w:tcPr>
+            <w:tcW w:type="dxa" w:w="1512"/>
+            <w:vAlign w:val="center"/>
+            <w:tcMar>
+              <w:top w:w="90" w:type="dxa"/>
+              <w:left w:w="90" w:type="dxa"/>
+              <w:bottom w:w="90" w:type="dxa"/>
+              <w:right w:w="90" w:type="dxa"/>
+            </w:tcMar>
+          </w:tcPr>
+          <w:p>
+            <w:pPr>
+              <w:spacing w:after="0" w:before="0" w:line="252" w:lineRule="auto"/>
+              <w:jc w:val="center"/>
+            </w:pPr>
+            <w:r>
+              <w:rPr>
+                <w:sz w:val="19"/>
+              </w:rPr>
               <w:t>POST</w:t>
             </w:r>
           </w:p>
         </w:tc>
         <w:tc>
           <w:tcPr>
-            <w:tcW w:type="dxa" w:w="2948"/>
-            <w:vAlign w:val="center"/>
-          </w:tcPr>
-          <w:p>
-            <w:pPr>
-              <w:spacing w:after="40" w:before="40"/>
-            </w:pPr>
-            <w:r>
+            <w:tcW w:type="dxa" w:w="5400"/>
+            <w:vAlign w:val="center"/>
+            <w:tcMar>
+              <w:top w:w="90" w:type="dxa"/>
+              <w:left w:w="90" w:type="dxa"/>
+              <w:bottom w:w="90" w:type="dxa"/>
+              <w:right w:w="90" w:type="dxa"/>
+            </w:tcMar>
+          </w:tcPr>
+          <w:p>
+            <w:pPr>
+              <w:spacing w:after="0" w:before="0" w:line="252" w:lineRule="auto"/>
+              <w:jc w:val="left"/>
+            </w:pPr>
+            <w:r>
+              <w:rPr>
+                <w:sz w:val="19"/>
+              </w:rPr>
               <w:t>/orders/{id}/refunds</w:t>
             </w:r>
           </w:p>
         </w:tc>
         <w:tc>
           <w:tcPr>
-            <w:tcW w:type="dxa" w:w="1814"/>
-            <w:vAlign w:val="center"/>
-          </w:tcPr>
-          <w:p>
-            <w:pPr>
-              <w:spacing w:after="40" w:before="40"/>
-            </w:pPr>
-            <w:r>
+            <w:tcW w:type="dxa" w:w="3096"/>
+            <w:vAlign w:val="center"/>
+            <w:tcMar>
+              <w:top w:w="90" w:type="dxa"/>
+              <w:left w:w="90" w:type="dxa"/>
+              <w:bottom w:w="90" w:type="dxa"/>
+              <w:right w:w="90" w:type="dxa"/>
+            </w:tcMar>
+          </w:tcPr>
+          <w:p>
+            <w:pPr>
+              <w:spacing w:after="0" w:before="0" w:line="252" w:lineRule="auto"/>
+              <w:jc w:val="center"/>
+            </w:pPr>
+            <w:r>
+              <w:rPr>
+                <w:sz w:val="19"/>
+              </w:rPr>
               <w:t>CUSTOMER</w:t>
             </w:r>
           </w:p>
         </w:tc>
         <w:tc>
           <w:tcPr>
-            <w:tcW w:type="dxa" w:w="3061"/>
-            <w:vAlign w:val="center"/>
-          </w:tcPr>
-          <w:p>
-            <w:pPr>
-              <w:spacing w:after="40" w:before="40"/>
-            </w:pPr>
-            <w:r>
+            <w:tcW w:type="dxa" w:w="4680"/>
+            <w:vAlign w:val="center"/>
+            <w:tcMar>
+              <w:top w:w="90" w:type="dxa"/>
+              <w:left w:w="90" w:type="dxa"/>
+              <w:bottom w:w="90" w:type="dxa"/>
+              <w:right w:w="90" w:type="dxa"/>
+            </w:tcMar>
+          </w:tcPr>
+          <w:p>
+            <w:pPr>
+              <w:spacing w:after="0" w:before="0" w:line="252" w:lineRule="auto"/>
+              <w:jc w:val="left"/>
+            </w:pPr>
+            <w:r>
+              <w:rPr>
+                <w:sz w:val="19"/>
+              </w:rPr>
               <w:t>申请退款</w:t>
             </w:r>
           </w:p>
         </w:tc>
       </w:tr>
       <w:tr>
-        <w:tc>
-          <w:tcPr>
-            <w:tcW w:type="dxa" w:w="1247"/>
-            <w:vAlign w:val="center"/>
-          </w:tcPr>
-          <w:p>
-            <w:pPr>
-              <w:spacing w:after="40" w:before="40"/>
-            </w:pPr>
-            <w:r>
+        <w:trPr>
+          <w:cantSplit/>
+        </w:trPr>
+        <w:tc>
+          <w:tcPr>
+            <w:tcW w:type="dxa" w:w="1512"/>
+            <w:vAlign w:val="center"/>
+            <w:tcMar>
+              <w:top w:w="90" w:type="dxa"/>
+              <w:left w:w="90" w:type="dxa"/>
+              <w:bottom w:w="90" w:type="dxa"/>
+              <w:right w:w="90" w:type="dxa"/>
+            </w:tcMar>
+          </w:tcPr>
+          <w:p>
+            <w:pPr>
+              <w:spacing w:after="0" w:before="0" w:line="252" w:lineRule="auto"/>
+              <w:jc w:val="center"/>
+            </w:pPr>
+            <w:r>
+              <w:rPr>
+                <w:sz w:val="19"/>
+              </w:rPr>
               <w:t>GET</w:t>
             </w:r>
           </w:p>
         </w:tc>
         <w:tc>
           <w:tcPr>
-            <w:tcW w:type="dxa" w:w="2948"/>
-            <w:vAlign w:val="center"/>
-          </w:tcPr>
-          <w:p>
-            <w:pPr>
-              <w:spacing w:after="40" w:before="40"/>
-            </w:pPr>
-            <w:r>
+            <w:tcW w:type="dxa" w:w="5400"/>
+            <w:vAlign w:val="center"/>
+            <w:tcMar>
+              <w:top w:w="90" w:type="dxa"/>
+              <w:left w:w="90" w:type="dxa"/>
+              <w:bottom w:w="90" w:type="dxa"/>
+              <w:right w:w="90" w:type="dxa"/>
+            </w:tcMar>
+          </w:tcPr>
+          <w:p>
+            <w:pPr>
+              <w:spacing w:after="0" w:before="0" w:line="252" w:lineRule="auto"/>
+              <w:jc w:val="left"/>
+            </w:pPr>
+            <w:r>
+              <w:rPr>
+                <w:sz w:val="19"/>
+              </w:rPr>
               <w:t>/refunds</w:t>
             </w:r>
           </w:p>
         </w:tc>
         <w:tc>
           <w:tcPr>
-            <w:tcW w:type="dxa" w:w="1814"/>
-            <w:vAlign w:val="center"/>
-          </w:tcPr>
-          <w:p>
-            <w:pPr>
-              <w:spacing w:after="40" w:before="40"/>
-            </w:pPr>
-            <w:r>
+            <w:tcW w:type="dxa" w:w="3096"/>
+            <w:vAlign w:val="center"/>
+            <w:tcMar>
+              <w:top w:w="90" w:type="dxa"/>
+              <w:left w:w="90" w:type="dxa"/>
+              <w:bottom w:w="90" w:type="dxa"/>
+              <w:right w:w="90" w:type="dxa"/>
+            </w:tcMar>
+          </w:tcPr>
+          <w:p>
+            <w:pPr>
+              <w:spacing w:after="0" w:before="0" w:line="252" w:lineRule="auto"/>
+              <w:jc w:val="center"/>
+            </w:pPr>
+            <w:r>
+              <w:rPr>
+                <w:sz w:val="19"/>
+              </w:rPr>
               <w:t>CUSTOMER</w:t>
             </w:r>
           </w:p>
         </w:tc>
         <w:tc>
           <w:tcPr>
-            <w:tcW w:type="dxa" w:w="3061"/>
-            <w:vAlign w:val="center"/>
-          </w:tcPr>
-          <w:p>
-            <w:pPr>
-              <w:spacing w:after="40" w:before="40"/>
-            </w:pPr>
-            <w:r>
+            <w:tcW w:type="dxa" w:w="4680"/>
+            <w:vAlign w:val="center"/>
+            <w:tcMar>
+              <w:top w:w="90" w:type="dxa"/>
+              <w:left w:w="90" w:type="dxa"/>
+              <w:bottom w:w="90" w:type="dxa"/>
+              <w:right w:w="90" w:type="dxa"/>
+            </w:tcMar>
+          </w:tcPr>
+          <w:p>
+            <w:pPr>
+              <w:spacing w:after="0" w:before="0" w:line="252" w:lineRule="auto"/>
+              <w:jc w:val="left"/>
+            </w:pPr>
+            <w:r>
+              <w:rPr>
+                <w:sz w:val="19"/>
+              </w:rPr>
               <w:t>本人退款列表</w:t>
             </w:r>
           </w:p>
         </w:tc>
       </w:tr>
       <w:tr>
-        <w:tc>
-          <w:tcPr>
-            <w:tcW w:type="dxa" w:w="1247"/>
-            <w:vAlign w:val="center"/>
-          </w:tcPr>
-          <w:p>
-            <w:pPr>
-              <w:spacing w:after="40" w:before="40"/>
-            </w:pPr>
-            <w:r>
+        <w:trPr>
+          <w:cantSplit/>
+        </w:trPr>
+        <w:tc>
+          <w:tcPr>
+            <w:tcW w:type="dxa" w:w="1512"/>
+            <w:vAlign w:val="center"/>
+            <w:tcMar>
+              <w:top w:w="90" w:type="dxa"/>
+              <w:left w:w="90" w:type="dxa"/>
+              <w:bottom w:w="90" w:type="dxa"/>
+              <w:right w:w="90" w:type="dxa"/>
+            </w:tcMar>
+          </w:tcPr>
+          <w:p>
+            <w:pPr>
+              <w:spacing w:after="0" w:before="0" w:line="252" w:lineRule="auto"/>
+              <w:jc w:val="center"/>
+            </w:pPr>
+            <w:r>
+              <w:rPr>
+                <w:sz w:val="19"/>
+              </w:rPr>
               <w:t>GET/PATCH</w:t>
             </w:r>
           </w:p>
         </w:tc>
         <w:tc>
           <w:tcPr>
-            <w:tcW w:type="dxa" w:w="2948"/>
-            <w:vAlign w:val="center"/>
-          </w:tcPr>
-          <w:p>
-            <w:pPr>
-              <w:spacing w:after="40" w:before="40"/>
-            </w:pPr>
-            <w:r>
+            <w:tcW w:type="dxa" w:w="5400"/>
+            <w:vAlign w:val="center"/>
+            <w:tcMar>
+              <w:top w:w="90" w:type="dxa"/>
+              <w:left w:w="90" w:type="dxa"/>
+              <w:bottom w:w="90" w:type="dxa"/>
+              <w:right w:w="90" w:type="dxa"/>
+            </w:tcMar>
+          </w:tcPr>
+          <w:p>
+            <w:pPr>
+              <w:spacing w:after="0" w:before="0" w:line="252" w:lineRule="auto"/>
+              <w:jc w:val="left"/>
+            </w:pPr>
+            <w:r>
+              <w:rPr>
+                <w:sz w:val="19"/>
+              </w:rPr>
               <w:t>/merchant/refunds[/{id}]</w:t>
             </w:r>
           </w:p>
         </w:tc>
         <w:tc>
           <w:tcPr>
-            <w:tcW w:type="dxa" w:w="1814"/>
-            <w:vAlign w:val="center"/>
-          </w:tcPr>
-          <w:p>
-            <w:pPr>
-              <w:spacing w:after="40" w:before="40"/>
-            </w:pPr>
-            <w:r>
+            <w:tcW w:type="dxa" w:w="3096"/>
+            <w:vAlign w:val="center"/>
+            <w:tcMar>
+              <w:top w:w="90" w:type="dxa"/>
+              <w:left w:w="90" w:type="dxa"/>
+              <w:bottom w:w="90" w:type="dxa"/>
+              <w:right w:w="90" w:type="dxa"/>
+            </w:tcMar>
+          </w:tcPr>
+          <w:p>
+            <w:pPr>
+              <w:spacing w:after="0" w:before="0" w:line="252" w:lineRule="auto"/>
+              <w:jc w:val="center"/>
+            </w:pPr>
+            <w:r>
+              <w:rPr>
+                <w:sz w:val="19"/>
+              </w:rPr>
               <w:t>MERCHANT</w:t>
             </w:r>
           </w:p>
         </w:tc>
         <w:tc>
           <w:tcPr>
-            <w:tcW w:type="dxa" w:w="3061"/>
-            <w:vAlign w:val="center"/>
-          </w:tcPr>
-          <w:p>
-            <w:pPr>
-              <w:spacing w:after="40" w:before="40"/>
-            </w:pPr>
-            <w:r>
+            <w:tcW w:type="dxa" w:w="4680"/>
+            <w:vAlign w:val="center"/>
+            <w:tcMar>
+              <w:top w:w="90" w:type="dxa"/>
+              <w:left w:w="90" w:type="dxa"/>
+              <w:bottom w:w="90" w:type="dxa"/>
+              <w:right w:w="90" w:type="dxa"/>
+            </w:tcMar>
+          </w:tcPr>
+          <w:p>
+            <w:pPr>
+              <w:spacing w:after="0" w:before="0" w:line="252" w:lineRule="auto"/>
+              <w:jc w:val="left"/>
+            </w:pPr>
+            <w:r>
+              <w:rPr>
+                <w:sz w:val="19"/>
+              </w:rPr>
               <w:t>本店退款查询/处理</w:t>
             </w:r>
           </w:p>
         </w:tc>
       </w:tr>
       <w:tr>
-        <w:tc>
-          <w:tcPr>
-            <w:tcW w:type="dxa" w:w="1247"/>
-            <w:vAlign w:val="center"/>
-          </w:tcPr>
-          <w:p>
-            <w:pPr>
-              <w:spacing w:after="40" w:before="40"/>
-            </w:pPr>
-            <w:r>
+        <w:trPr>
+          <w:cantSplit/>
+        </w:trPr>
+        <w:tc>
+          <w:tcPr>
+            <w:tcW w:type="dxa" w:w="1512"/>
+            <w:vAlign w:val="center"/>
+            <w:tcMar>
+              <w:top w:w="90" w:type="dxa"/>
+              <w:left w:w="90" w:type="dxa"/>
+              <w:bottom w:w="90" w:type="dxa"/>
+              <w:right w:w="90" w:type="dxa"/>
+            </w:tcMar>
+          </w:tcPr>
+          <w:p>
+            <w:pPr>
+              <w:spacing w:after="0" w:before="0" w:line="252" w:lineRule="auto"/>
+              <w:jc w:val="center"/>
+            </w:pPr>
+            <w:r>
+              <w:rPr>
+                <w:sz w:val="19"/>
+              </w:rPr>
               <w:t>GET/POST</w:t>
             </w:r>
           </w:p>
         </w:tc>
         <w:tc>
           <w:tcPr>
-            <w:tcW w:type="dxa" w:w="2948"/>
-            <w:vAlign w:val="center"/>
-          </w:tcPr>
-          <w:p>
-            <w:pPr>
-              <w:spacing w:after="40" w:before="40"/>
-            </w:pPr>
-            <w:r>
+            <w:tcW w:type="dxa" w:w="5400"/>
+            <w:vAlign w:val="center"/>
+            <w:tcMar>
+              <w:top w:w="90" w:type="dxa"/>
+              <w:left w:w="90" w:type="dxa"/>
+              <w:bottom w:w="90" w:type="dxa"/>
+              <w:right w:w="90" w:type="dxa"/>
+            </w:tcMar>
+          </w:tcPr>
+          <w:p>
+            <w:pPr>
+              <w:spacing w:after="0" w:before="0" w:line="252" w:lineRule="auto"/>
+              <w:jc w:val="left"/>
+            </w:pPr>
+            <w:r>
+              <w:rPr>
+                <w:sz w:val="19"/>
+              </w:rPr>
               <w:t>/rider/orders/**</w:t>
             </w:r>
           </w:p>
         </w:tc>
         <w:tc>
           <w:tcPr>
-            <w:tcW w:type="dxa" w:w="1814"/>
-            <w:vAlign w:val="center"/>
-          </w:tcPr>
-          <w:p>
-            <w:pPr>
-              <w:spacing w:after="40" w:before="40"/>
-            </w:pPr>
-            <w:r>
+            <w:tcW w:type="dxa" w:w="3096"/>
+            <w:vAlign w:val="center"/>
+            <w:tcMar>
+              <w:top w:w="90" w:type="dxa"/>
+              <w:left w:w="90" w:type="dxa"/>
+              <w:bottom w:w="90" w:type="dxa"/>
+              <w:right w:w="90" w:type="dxa"/>
+            </w:tcMar>
+          </w:tcPr>
+          <w:p>
+            <w:pPr>
+              <w:spacing w:after="0" w:before="0" w:line="252" w:lineRule="auto"/>
+              <w:jc w:val="center"/>
+            </w:pPr>
+            <w:r>
+              <w:rPr>
+                <w:sz w:val="19"/>
+              </w:rPr>
               <w:t>RIDER</w:t>
             </w:r>
           </w:p>
         </w:tc>
         <w:tc>
           <w:tcPr>
-            <w:tcW w:type="dxa" w:w="3061"/>
-            <w:vAlign w:val="center"/>
-          </w:tcPr>
-          <w:p>
-            <w:pPr>
-              <w:spacing w:after="40" w:before="40"/>
-            </w:pPr>
-            <w:r>
+            <w:tcW w:type="dxa" w:w="4680"/>
+            <w:vAlign w:val="center"/>
+            <w:tcMar>
+              <w:top w:w="90" w:type="dxa"/>
+              <w:left w:w="90" w:type="dxa"/>
+              <w:bottom w:w="90" w:type="dxa"/>
+              <w:right w:w="90" w:type="dxa"/>
+            </w:tcMar>
+          </w:tcPr>
+          <w:p>
+            <w:pPr>
+              <w:spacing w:after="0" w:before="0" w:line="252" w:lineRule="auto"/>
+              <w:jc w:val="left"/>
+            </w:pPr>
+            <w:r>
+              <w:rPr>
+                <w:sz w:val="19"/>
+              </w:rPr>
               <w:t>可接单、本人任务、领取、送达</w:t>
             </w:r>
           </w:p>
         </w:tc>
       </w:tr>
       <w:tr>
-        <w:tc>
-          <w:tcPr>
-            <w:tcW w:type="dxa" w:w="1247"/>
-            <w:vAlign w:val="center"/>
-          </w:tcPr>
-          <w:p>
-            <w:pPr>
-              <w:spacing w:after="40" w:before="40"/>
-            </w:pPr>
-            <w:r>
+        <w:trPr>
+          <w:cantSplit/>
+        </w:trPr>
+        <w:tc>
+          <w:tcPr>
+            <w:tcW w:type="dxa" w:w="1512"/>
+            <w:vAlign w:val="center"/>
+            <w:tcMar>
+              <w:top w:w="90" w:type="dxa"/>
+              <w:left w:w="90" w:type="dxa"/>
+              <w:bottom w:w="90" w:type="dxa"/>
+              <w:right w:w="90" w:type="dxa"/>
+            </w:tcMar>
+          </w:tcPr>
+          <w:p>
+            <w:pPr>
+              <w:spacing w:after="0" w:before="0" w:line="252" w:lineRule="auto"/>
+              <w:jc w:val="center"/>
+            </w:pPr>
+            <w:r>
+              <w:rPr>
+                <w:sz w:val="19"/>
+              </w:rPr>
               <w:t>GET/PATCH</w:t>
             </w:r>
           </w:p>
         </w:tc>
         <w:tc>
           <w:tcPr>
-            <w:tcW w:type="dxa" w:w="2948"/>
-            <w:vAlign w:val="center"/>
-          </w:tcPr>
-          <w:p>
-            <w:pPr>
-              <w:spacing w:after="40" w:before="40"/>
-            </w:pPr>
-            <w:r>
+            <w:tcW w:type="dxa" w:w="5400"/>
+            <w:vAlign w:val="center"/>
+            <w:tcMar>
+              <w:top w:w="90" w:type="dxa"/>
+              <w:left w:w="90" w:type="dxa"/>
+              <w:bottom w:w="90" w:type="dxa"/>
+              <w:right w:w="90" w:type="dxa"/>
+            </w:tcMar>
+          </w:tcPr>
+          <w:p>
+            <w:pPr>
+              <w:spacing w:after="0" w:before="0" w:line="252" w:lineRule="auto"/>
+              <w:jc w:val="left"/>
+            </w:pPr>
+            <w:r>
+              <w:rPr>
+                <w:sz w:val="19"/>
+              </w:rPr>
               <w:t>/admin/users|merchants|products|orders|refunds</w:t>
             </w:r>
           </w:p>
         </w:tc>
         <w:tc>
           <w:tcPr>
-            <w:tcW w:type="dxa" w:w="1814"/>
-            <w:vAlign w:val="center"/>
-          </w:tcPr>
-          <w:p>
-            <w:pPr>
-              <w:spacing w:after="40" w:before="40"/>
-            </w:pPr>
-            <w:r>
+            <w:tcW w:type="dxa" w:w="3096"/>
+            <w:vAlign w:val="center"/>
+            <w:tcMar>
+              <w:top w:w="90" w:type="dxa"/>
+              <w:left w:w="90" w:type="dxa"/>
+              <w:bottom w:w="90" w:type="dxa"/>
+              <w:right w:w="90" w:type="dxa"/>
+            </w:tcMar>
+          </w:tcPr>
+          <w:p>
+            <w:pPr>
+              <w:spacing w:after="0" w:before="0" w:line="252" w:lineRule="auto"/>
+              <w:jc w:val="center"/>
+            </w:pPr>
+            <w:r>
+              <w:rPr>
+                <w:sz w:val="19"/>
+              </w:rPr>
               <w:t>ADMIN</w:t>
             </w:r>
           </w:p>
         </w:tc>
         <w:tc>
           <w:tcPr>
-            <w:tcW w:type="dxa" w:w="3061"/>
-            <w:vAlign w:val="center"/>
-          </w:tcPr>
-          <w:p>
-            <w:pPr>
-              <w:spacing w:after="40" w:before="40"/>
-            </w:pPr>
-            <w:r>
+            <w:tcW w:type="dxa" w:w="4680"/>
+            <w:vAlign w:val="center"/>
+            <w:tcMar>
+              <w:top w:w="90" w:type="dxa"/>
+              <w:left w:w="90" w:type="dxa"/>
+              <w:bottom w:w="90" w:type="dxa"/>
+              <w:right w:w="90" w:type="dxa"/>
+            </w:tcMar>
+          </w:tcPr>
+          <w:p>
+            <w:pPr>
+              <w:spacing w:after="0" w:before="0" w:line="252" w:lineRule="auto"/>
+              <w:jc w:val="left"/>
+            </w:pPr>
+            <w:r>
+              <w:rPr>
+                <w:sz w:val="19"/>
+              </w:rPr>
               <w:t>平台查询和受控管理</w:t>
             </w:r>
           </w:p>
         </w:tc>
       </w:tr>
       <w:tr>
-        <w:tc>
-          <w:tcPr>
-            <w:tcW w:type="dxa" w:w="1247"/>
-            <w:vAlign w:val="center"/>
-          </w:tcPr>
-          <w:p>
-            <w:pPr>
-              <w:spacing w:after="40" w:before="40"/>
-            </w:pPr>
-            <w:r>
+        <w:trPr>
+          <w:cantSplit/>
+        </w:trPr>
+        <w:tc>
+          <w:tcPr>
+            <w:tcW w:type="dxa" w:w="1512"/>
+            <w:vAlign w:val="center"/>
+            <w:tcMar>
+              <w:top w:w="90" w:type="dxa"/>
+              <w:left w:w="90" w:type="dxa"/>
+              <w:bottom w:w="90" w:type="dxa"/>
+              <w:right w:w="90" w:type="dxa"/>
+            </w:tcMar>
+          </w:tcPr>
+          <w:p>
+            <w:pPr>
+              <w:spacing w:after="0" w:before="0" w:line="252" w:lineRule="auto"/>
+              <w:jc w:val="center"/>
+            </w:pPr>
+            <w:r>
+              <w:rPr>
+                <w:sz w:val="19"/>
+              </w:rPr>
               <w:t>POST</w:t>
             </w:r>
           </w:p>
         </w:tc>
         <w:tc>
           <w:tcPr>
-            <w:tcW w:type="dxa" w:w="2948"/>
-            <w:vAlign w:val="center"/>
-          </w:tcPr>
-          <w:p>
-            <w:pPr>
-              <w:spacing w:after="40" w:before="40"/>
-            </w:pPr>
-            <w:r>
+            <w:tcW w:type="dxa" w:w="5400"/>
+            <w:vAlign w:val="center"/>
+            <w:tcMar>
+              <w:top w:w="90" w:type="dxa"/>
+              <w:left w:w="90" w:type="dxa"/>
+              <w:bottom w:w="90" w:type="dxa"/>
+              <w:right w:w="90" w:type="dxa"/>
+            </w:tcMar>
+          </w:tcPr>
+          <w:p>
+            <w:pPr>
+              <w:spacing w:after="0" w:before="0" w:line="252" w:lineRule="auto"/>
+              <w:jc w:val="left"/>
+            </w:pPr>
+            <w:r>
+              <w:rPr>
+                <w:sz w:val="19"/>
+              </w:rPr>
               <w:t>/images?targetType&amp;targetId</w:t>
             </w:r>
           </w:p>
         </w:tc>
         <w:tc>
           <w:tcPr>
-            <w:tcW w:type="dxa" w:w="1814"/>
-            <w:vAlign w:val="center"/>
-          </w:tcPr>
-          <w:p>
-            <w:pPr>
-              <w:spacing w:after="40" w:before="40"/>
-            </w:pPr>
-            <w:r>
+            <w:tcW w:type="dxa" w:w="3096"/>
+            <w:vAlign w:val="center"/>
+            <w:tcMar>
+              <w:top w:w="90" w:type="dxa"/>
+              <w:left w:w="90" w:type="dxa"/>
+              <w:bottom w:w="90" w:type="dxa"/>
+              <w:right w:w="90" w:type="dxa"/>
+            </w:tcMar>
+          </w:tcPr>
+          <w:p>
+            <w:pPr>
+              <w:spacing w:after="0" w:before="0" w:line="252" w:lineRule="auto"/>
+              <w:jc w:val="center"/>
+            </w:pPr>
+            <w:r>
+              <w:rPr>
+                <w:sz w:val="19"/>
+              </w:rPr>
               <w:t>CUSTOMER/MERCHANT/ADMIN</w:t>
             </w:r>
           </w:p>
         </w:tc>
         <w:tc>
           <w:tcPr>
-            <w:tcW w:type="dxa" w:w="3061"/>
-            <w:vAlign w:val="center"/>
-          </w:tcPr>
-          <w:p>
-            <w:pPr>
-              <w:spacing w:after="40" w:before="40"/>
-            </w:pPr>
-            <w:r>
+            <w:tcW w:type="dxa" w:w="4680"/>
+            <w:vAlign w:val="center"/>
+            <w:tcMar>
+              <w:top w:w="90" w:type="dxa"/>
+              <w:left w:w="90" w:type="dxa"/>
+              <w:bottom w:w="90" w:type="dxa"/>
+              <w:right w:w="90" w:type="dxa"/>
+            </w:tcMar>
+          </w:tcPr>
+          <w:p>
+            <w:pPr>
+              <w:spacing w:after="0" w:before="0" w:line="252" w:lineRule="auto"/>
+              <w:jc w:val="left"/>
+            </w:pPr>
+            <w:r>
+              <w:rPr>
+                <w:sz w:val="19"/>
+              </w:rPr>
               <w:t>上传并关联图片</w:t>
             </w:r>
           </w:p>
         </w:tc>
       </w:tr>
       <w:tr>
-        <w:tc>
-          <w:tcPr>
-            <w:tcW w:type="dxa" w:w="1247"/>
-            <w:vAlign w:val="center"/>
-          </w:tcPr>
-          <w:p>
-            <w:pPr>
-              <w:spacing w:after="40" w:before="40"/>
-            </w:pPr>
-            <w:r>
+        <w:trPr>
+          <w:cantSplit/>
+        </w:trPr>
+        <w:tc>
+          <w:tcPr>
+            <w:tcW w:type="dxa" w:w="1512"/>
+            <w:vAlign w:val="center"/>
+            <w:tcMar>
+              <w:top w:w="90" w:type="dxa"/>
+              <w:left w:w="90" w:type="dxa"/>
+              <w:bottom w:w="90" w:type="dxa"/>
+              <w:right w:w="90" w:type="dxa"/>
+            </w:tcMar>
+          </w:tcPr>
+          <w:p>
+            <w:pPr>
+              <w:spacing w:after="0" w:before="0" w:line="252" w:lineRule="auto"/>
+              <w:jc w:val="center"/>
+            </w:pPr>
+            <w:r>
+              <w:rPr>
+                <w:sz w:val="19"/>
+              </w:rPr>
               <w:t>DELETE</w:t>
             </w:r>
           </w:p>
         </w:tc>
         <w:tc>
           <w:tcPr>
-            <w:tcW w:type="dxa" w:w="2948"/>
-            <w:vAlign w:val="center"/>
-          </w:tcPr>
-          <w:p>
-            <w:pPr>
-              <w:spacing w:after="40" w:before="40"/>
-            </w:pPr>
-            <w:r>
+            <w:tcW w:type="dxa" w:w="5400"/>
+            <w:vAlign w:val="center"/>
+            <w:tcMar>
+              <w:top w:w="90" w:type="dxa"/>
+              <w:left w:w="90" w:type="dxa"/>
+              <w:bottom w:w="90" w:type="dxa"/>
+              <w:right w:w="90" w:type="dxa"/>
+            </w:tcMar>
+          </w:tcPr>
+          <w:p>
+            <w:pPr>
+              <w:spacing w:after="0" w:before="0" w:line="252" w:lineRule="auto"/>
+              <w:jc w:val="left"/>
+            </w:pPr>
+            <w:r>
+              <w:rPr>
+                <w:sz w:val="19"/>
+              </w:rPr>
               <w:t>/users/me</w:t>
             </w:r>
           </w:p>
         </w:tc>
         <w:tc>
           <w:tcPr>
-            <w:tcW w:type="dxa" w:w="1814"/>
-            <w:vAlign w:val="center"/>
-          </w:tcPr>
-          <w:p>
-            <w:pPr>
-              <w:spacing w:after="40" w:before="40"/>
-            </w:pPr>
-            <w:r>
+            <w:tcW w:type="dxa" w:w="3096"/>
+            <w:vAlign w:val="center"/>
+            <w:tcMar>
+              <w:top w:w="90" w:type="dxa"/>
+              <w:left w:w="90" w:type="dxa"/>
+              <w:bottom w:w="90" w:type="dxa"/>
+              <w:right w:w="90" w:type="dxa"/>
+            </w:tcMar>
+          </w:tcPr>
+          <w:p>
+            <w:pPr>
+              <w:spacing w:after="0" w:before="0" w:line="252" w:lineRule="auto"/>
+              <w:jc w:val="center"/>
+            </w:pPr>
+            <w:r>
+              <w:rPr>
+                <w:sz w:val="19"/>
+              </w:rPr>
               <w:t>CUSTOMER</w:t>
             </w:r>
           </w:p>
         </w:tc>
         <w:tc>
           <w:tcPr>
-            <w:tcW w:type="dxa" w:w="3061"/>
-            <w:vAlign w:val="center"/>
-          </w:tcPr>
-          <w:p>
-            <w:pPr>
-              <w:spacing w:after="40" w:before="40"/>
-            </w:pPr>
-            <w:r>
+            <w:tcW w:type="dxa" w:w="4680"/>
+            <w:vAlign w:val="center"/>
+            <w:tcMar>
+              <w:top w:w="90" w:type="dxa"/>
+              <w:left w:w="90" w:type="dxa"/>
+              <w:bottom w:w="90" w:type="dxa"/>
+              <w:right w:w="90" w:type="dxa"/>
+            </w:tcMar>
+          </w:tcPr>
+          <w:p>
+            <w:pPr>
+              <w:spacing w:after="0" w:before="0" w:line="252" w:lineRule="auto"/>
+              <w:jc w:val="left"/>
+            </w:pPr>
+            <w:r>
+              <w:rPr>
+                <w:sz w:val="19"/>
+              </w:rPr>
               <w:t>注销顾客账号</w:t>
             </w:r>
           </w:p>
         </w:tc>
       </w:tr>
     </w:tbl>
+    <w:p>
+      <w:pPr>
+        <w:sectPr>
+          <w:headerReference w:type="default" r:id="rId9"/>
+          <w:footerReference w:type="default" r:id="rId10"/>
+          <w:pgSz w:w="16838" w:h="11906" w:orient="landscape"/>
+          <w:pgMar w:top="720" w:right="864" w:bottom="720" w:left="864" w:header="720" w:footer="720" w:gutter="0"/>
+          <w:cols w:space="720"/>
+          <w:docGrid w:linePitch="360"/>
+          <w:type w:val="nextPage"/>
+        </w:sectPr>
+      </w:pPr>
+    </w:p>
     <w:p>
       <w:pPr>
         <w:pStyle w:val="Heading1"/>

</xml_diff>